<commit_message>
Final Version.  Simulated Annealing with Route Evolution Visualized.  Tic Tac Toe with UI for game play, and visualization of MiniMax Decision Making
</commit_message>
<xml_diff>
--- a/E4_Simulated_Annealing/Report.docx
+++ b/E4_Simulated_Annealing/Report.docx
@@ -19,8 +19,6 @@
         </w:rPr>
         <w:t>Traveling Salesperson Problem (TSP) Solver using Simulated Annealing</w:t>
       </w:r>
-      <w:bookmarkStart w:id="0" w:name="_GoBack"/>
-      <w:bookmarkEnd w:id="0"/>
     </w:p>
     <w:p>
       <w:pPr>
@@ -1125,6 +1123,87 @@
       <w:pPr>
         <w:jc w:val="left"/>
         <w:rPr>
+          <w:rStyle w:val="Hyperlink"/>
+          <w:b/>
+          <w:bCs/>
+          <w:sz w:val="22"/>
+        </w:rPr>
+      </w:pPr>
+      <w:hyperlink r:id="rId5" w:history="1">
+        <w:r>
+          <w:rPr>
+            <w:rStyle w:val="Hyperlink"/>
+            <w:b/>
+            <w:bCs/>
+            <w:sz w:val="22"/>
+          </w:rPr>
+          <w:t>Route Evolution Visualization</w:t>
+        </w:r>
+      </w:hyperlink>
+    </w:p>
+    <w:p>
+      <w:pPr>
+        <w:jc w:val="left"/>
+        <w:rPr>
+          <w:b/>
+          <w:bCs/>
+          <w:sz w:val="22"/>
+        </w:rPr>
+      </w:pPr>
+      <w:r>
+        <w:rPr>
+          <w:b/>
+          <w:bCs/>
+          <w:noProof/>
+          <w:sz w:val="22"/>
+        </w:rPr>
+        <w:drawing>
+          <wp:inline distT="0" distB="0" distL="0" distR="0">
+            <wp:extent cx="5731510" cy="3820795"/>
+            <wp:effectExtent l="0" t="0" r="2540" b="8255"/>
+            <wp:docPr id="1" name="Picture 1"/>
+            <wp:cNvGraphicFramePr>
+              <a:graphicFrameLocks xmlns:a="http://schemas.openxmlformats.org/drawingml/2006/main" noChangeAspect="1"/>
+            </wp:cNvGraphicFramePr>
+            <a:graphic xmlns:a="http://schemas.openxmlformats.org/drawingml/2006/main">
+              <a:graphicData uri="http://schemas.openxmlformats.org/drawingml/2006/picture">
+                <pic:pic xmlns:pic="http://schemas.openxmlformats.org/drawingml/2006/picture">
+                  <pic:nvPicPr>
+                    <pic:cNvPr id="1" name="city_route.png"/>
+                    <pic:cNvPicPr/>
+                  </pic:nvPicPr>
+                  <pic:blipFill>
+                    <a:blip r:embed="rId6">
+                      <a:extLst>
+                        <a:ext uri="{28A0092B-C50C-407E-A947-70E740481C1C}">
+                          <a14:useLocalDpi xmlns:a14="http://schemas.microsoft.com/office/drawing/2010/main" val="0"/>
+                        </a:ext>
+                      </a:extLst>
+                    </a:blip>
+                    <a:stretch>
+                      <a:fillRect/>
+                    </a:stretch>
+                  </pic:blipFill>
+                  <pic:spPr>
+                    <a:xfrm>
+                      <a:off x="0" y="0"/>
+                      <a:ext cx="5731510" cy="3820795"/>
+                    </a:xfrm>
+                    <a:prstGeom prst="rect">
+                      <a:avLst/>
+                    </a:prstGeom>
+                  </pic:spPr>
+                </pic:pic>
+              </a:graphicData>
+            </a:graphic>
+          </wp:inline>
+        </w:drawing>
+      </w:r>
+    </w:p>
+    <w:p>
+      <w:pPr>
+        <w:jc w:val="left"/>
+        <w:rPr>
           <w:b/>
           <w:bCs/>
           <w:sz w:val="22"/>
@@ -1138,6 +1217,8 @@
         </w:rPr>
         <w:t>3.1 Output Summary</w:t>
       </w:r>
+      <w:bookmarkStart w:id="0" w:name="_GoBack"/>
+      <w:bookmarkEnd w:id="0"/>
     </w:p>
     <w:p>
       <w:pPr>
@@ -1184,6 +1265,7 @@
           <w:i/>
           <w:sz w:val="22"/>
         </w:rPr>
+        <w:lastRenderedPageBreak/>
         <w:t>Final solution distance: 945.30</w:t>
       </w:r>
     </w:p>
@@ -1470,7 +1552,6 @@
           <w:bCs/>
           <w:sz w:val="22"/>
         </w:rPr>
-        <w:lastRenderedPageBreak/>
         <w:t>Visualization:</w:t>
       </w:r>
       <w:r>
@@ -1685,6 +1766,7 @@
         <w:rPr>
           <w:sz w:val="18"/>
         </w:rPr>
+        <w:lastRenderedPageBreak/>
         <w:t xml:space="preserve">Kirkpatrick, S., </w:t>
       </w:r>
       <w:proofErr w:type="spellStart"/>
@@ -1881,7 +1963,7 @@
           <w:sz w:val="18"/>
         </w:rPr>
       </w:pPr>
-      <w:hyperlink r:id="rId5" w:history="1">
+      <w:hyperlink r:id="rId7" w:history="1">
         <w:r>
           <w:rPr>
             <w:rStyle w:val="Hyperlink"/>

</xml_diff>